<commit_message>
feat: format and edit right-to-left text
Runs with w:rtl or w:cs take their complex-script font, size, bold, and
italic, and formatting commands write both halves on those runs. Bidi
paragraphs read w:jc as leading and trailing edges, and alignment, paste,
and copy follow each paragraph's direction. Adds setParagraphDirection,
the direction.ltr and direction.rtl slots, the Paragraph dialog field, and
the Ctrl+Shift chords.

PDF export joins Arabic across fallback faces and run boundaries, falls
back to a Hebrew face, draws synthetic bold and italic, writes a logical
RTL text layer, and bounds composite glyph expansion from embedded fonts.

Fixes #864

Co-Authored-By: Claude Opus 5.5 (1M context) <noreply@anthropic.com>
</commit_message>
<xml_diff>
--- a/e2e/fixtures/paragraph-acceptance.docx
+++ b/e2e/fixtures/paragraph-acceptance.docx
@@ -232,6 +232,14 @@
       </w:pPr>
       <w:r>
         <w:t xml:space="preserve">paragraph property shd</w:t>
+      </w:r>
+    </w:p>
+    <w:p>
+      <w:pPr>
+        <w:bidi/>
+      </w:pPr>
+      <w:r>
+        <w:t xml:space="preserve">paragraph property bidi</w:t>
       </w:r>
     </w:p>
     <w:p>

</xml_diff>